<commit_message>
05: quintiles winsorizados como en 06/Tabla 1; HonestDiD opcional; quintiles como eje y tamaño a anexo
Co-Authored-By: Claude Sonnet 5 <noreply@anthropic.com>
</commit_message>
<xml_diff>
--- a/4. RESULTADOS/05_resultados_y_mecanismos/T09a_rangos_quintiles_kaitz.docx
+++ b/4. RESULTADOS/05_resultados_y_mecanismos/T09a_rangos_quintiles_kaitz.docx
@@ -712,7 +712,7 @@
                 <w:szCs w:val="22"/>
                 <w:color w:val="000000"/>
               </w:rPr>
-              <w:t xml:space="preserve">1,020</w:t>
+              <w:t xml:space="preserve">1,022</w:t>
             </w:r>
           </w:p>
         </w:tc>
@@ -992,7 +992,7 @@
                 <w:szCs w:val="22"/>
                 <w:color w:val="000000"/>
               </w:rPr>
-              <w:t xml:space="preserve">1,020</w:t>
+              <w:t xml:space="preserve">1,017</w:t>
             </w:r>
           </w:p>
         </w:tc>
@@ -1552,7 +1552,7 @@
                 <w:szCs w:val="22"/>
                 <w:color w:val="000000"/>
               </w:rPr>
-              <w:t xml:space="preserve">1,019</w:t>
+              <w:t xml:space="preserve">1,020</w:t>
             </w:r>
           </w:p>
         </w:tc>

</xml_diff>